<commit_message>
v10: author details filled in (corresponding author, e-mails, ORCID, contributions, re-use, editorial board)
Qu's answers of 2026-10-01 are entered at the top of the builder; title page, cover letter and their Word files rebuilt, the
anonymised manuscript is unchanged. The contribution sentence (CRediT roles after Qu's wording) still awaits Qu's confirmation.
Audit: 101 checks pass. Checklist section 9, README and PROJECT_LOG updated.

Co-Authored-By: Claude <noreply@anthropic.com>
Claude-Session: https://claude.ai/code/session_01SMspJ2iUSjtgJAMnLGppxV
</commit_message>
<xml_diff>
--- a/youwen/manuscript/submission/Cover_letter.docx
+++ b/youwen/manuscript/submission/Cover_letter.docx
@@ -261,18 +261,7 @@
         </w:numPr>
       </w:pPr>
       <w:r>
-        <w:t xml:space="preserve">Re-use of material:</w:t>
-      </w:r>
-      <w:r>
-        <w:t xml:space="preserve"> </w:t>
-      </w:r>
-      <w:r>
-        <w:rPr>
-          <w:b/>
-          <w:bCs/>
-          <w:highlight w:val="yellow"/>
-        </w:rPr>
-        <w:t xml:space="preserve">[TO BE CONFIRMED: the authors confirm that the manuscript re-uses no text, tables or figures from earlier publications, theses or conference papers; otherwise say what is re-used]</w:t>
+        <w:t xml:space="preserve">Re-use of material: The manuscript re-uses no text, tables or figures from earlier publications, theses or conference papers.</w:t>
       </w:r>
     </w:p>
     <w:p>
@@ -344,12 +333,7 @@
         <w:pStyle w:val="LetterText"/>
       </w:pPr>
       <w:r>
-        <w:rPr>
-          <w:b/>
-          <w:bCs/>
-          <w:highlight w:val="yellow"/>
-        </w:rPr>
-        <w:t xml:space="preserve">[TO BE SUPPLIED: name of the corresponding author]</w:t>
+        <w:t xml:space="preserve">Yusen Wu</w:t>
       </w:r>
     </w:p>
     <w:p>

</xml_diff>